<commit_message>
Retira el documento de estado de resultados del repositorio
El documento docs/Estado_de_resultados.docx era una nota de seguimiento
del desarrollo, fechada el 29 de julio, y contradecia la memoria final en
varios puntos: presentaba como significativos los contrastes de Fisher y
Wilcoxon que la memoria declara no reproducibles, afirmaba que ningun
modelo de 14B o mas habia destruido fraude cuando el experimento E6 mide
doce casos, omitia Random Forest de la comparativa de detectores y
listaba como pendiente la comparativa de modelos sobre turnos reales, que
es el experimento E6.

La trazabilidad de las cifras no depende de ese documento: los 115
ficheros de reports/ estan versionados y la nota al pie del capitulo 6
los cita directamente. Se vuelve a ignorar docs/ por completo.
</commit_message>
<xml_diff>
--- a/memoria/Memoria_TFG_v5.docx
+++ b/memoria/Memoria_TFG_v5.docx
@@ -20609,7 +20609,7 @@
         <w:jc w:val="both"/>
       </w:pPr>
       <w:r>
-        <w:t>Este capítulo presenta los resultados de los doce experimentos realizados. Todas las cifras proceden de ejecuciones registradas en fichero, disponibles en el repositorio del proyecto junto con el documento de estado de resultados.</w:t>
+        <w:t>Este capítulo presenta los resultados de los doce experimentos realizados. Todas las cifras proceden de ejecuciones registradas en fichero, disponibles en el repositorio del proyecto.</w:t>
       </w:r>
       <w:r>
         <w:rPr>
@@ -44723,7 +44723,7 @@
         <w:rPr>
           <w:sz w:val="18"/>
         </w:rPr>
-        <w:t xml:space="preserve"> El documento de estado de resultados (docs/Estado_de_resultados.docx) y los ficheros de datos de cada ejecución (directorio reports/) están disponibles en el repositorio del proyecto: https://github.com/adrmurbau/tfg-multiagente-fraude</w:t>
+        <w:t xml:space="preserve"> Los ficheros de datos de cada ejecución, en formato CSV y JSON, están en el directorio reports/ del repositorio del proyecto: https://github.com/adrmurbau/tfg-multiagente-fraude</w:t>
       </w:r>
     </w:p>
   </w:footnote>

</xml_diff>